<commit_message>
Sync full Aarogya One Connect codebase: marketing site, demo seeds, live verify tooling, and app updates.
Includes expanded Alpha/GP demo patients, www pricing and demo deck, voice transcription helpers, and release smoke/verify scripts. Excludes local secrets, APK backups, deploy password scripts, and CI workflow (OAuth token lacks workflow scope).

Co-authored-by: Cursor <cursoragent@cursor.com>
</commit_message>
<xml_diff>
--- a/docs/Healthcare_Secure_Handbook.docx
+++ b/docs/Healthcare_Secure_Handbook.docx
@@ -97,7 +97,7 @@
           <w:i w:val="0"/>
           <w:sz w:val="24"/>
         </w:rPr>
-        <w:t>From first scaffold to current clinic app — architecture, Android/Capacitor, analytics, ABDM/SMS/multi-tenant, gynae decision support, cloud Hostinger ops, patient billing / Razorpay UPI QR, video consult, browser desk (app.*), Today-only patient pick, persisted lab orders, stale-APK + CORS RCA, secrets, VPS deploy</w:t>
+        <w:t>From first scaffold to current clinic app — architecture, Android/Capacitor, analytics, ABDM/SMS/multi-tenant, gynae decision support, cloud Hostinger ops, patient billing / Razorpay UPI QR, video consult, browser desk (app.*), Today-only patient pick, persisted lab orders, stale-APK + CORS RCA, lab clinical-search RBAC, persisted clinic gate tickets, marketing assets, secrets, VPS deploy</w:t>
       </w:r>
     </w:p>
     <w:p>
@@ -114,7 +114,7 @@
         </w:rPr>
         <w:t>Application version baseline: 0.1.0 (+ Unreleased features documented herein)</w:t>
         <w:br/>
-        <w:t>Document edition: 15 August 2026 (includes Era O: Today-only pick, doctor→Visit after lock, persisted lab orders, 15s chart poll, browser desk at app.*, CORS Failed-to-fetch RCA, Lab Desk 403 lock RCA; share APK v1.48)</w:t>
+        <w:t>Document edition: 23 August 2026 (includes Era P: lab clinical-search RBAC, persisted clinic gate tickets, Android hardening, marketing &amp; DPA assets; share APK v1.60)</w:t>
         <w:br/>
         <w:t>Audience: students learning Android (Capacitor), FastAPI, and clinic workflows</w:t>
         <w:br/>
@@ -3837,6 +3837,166 @@
           <w:sz w:val="22"/>
         </w:rPr>
         <w:t>How to verify: Browser: open https://app.aarogyaoneconnect.in → clinic name + password → receptionist/staff PIN. Doctor APK: after PIN land on Patient Info; lock from All patients → Visit. Tick a diagnostic on Visit; Lab Desk on another device sees it under Ordered from Visit within ~15s.</w:t>
+      </w:r>
+    </w:p>
+    <w:p>
+      <w:pPr>
+        <w:pStyle w:val="Heading2"/>
+      </w:pPr>
+      <w:r>
+        <w:rPr>
+          <w:rFonts w:ascii="Calibri" w:hAnsi="Calibri" w:eastAsia="Calibri"/>
+          <w:b/>
+          <w:i w:val="0"/>
+          <w:sz w:val="28"/>
+        </w:rPr>
+        <w:t>Era P — Lab RBAC, persisted tickets, hardening &amp; marketing (23 Aug 2026)</w:t>
+      </w:r>
+    </w:p>
+    <w:p>
+      <w:pPr>
+        <w:spacing w:after="160" w:line="240" w:lineRule="auto"/>
+      </w:pPr>
+      <w:r>
+        <w:rPr>
+          <w:rFonts w:ascii="Calibri" w:hAnsi="Calibri" w:eastAsia="Calibri"/>
+          <w:b w:val="0"/>
+          <w:i w:val="0"/>
+          <w:sz w:val="22"/>
+        </w:rPr>
+        <w:t>Goal: Harden production security, fix lab desk scoping, and ship B2B marketing assets.</w:t>
+      </w:r>
+    </w:p>
+    <w:p>
+      <w:pPr>
+        <w:spacing w:after="80" w:line="240" w:lineRule="auto"/>
+      </w:pPr>
+      <w:r>
+        <w:rPr>
+          <w:rFonts w:ascii="Calibri" w:hAnsi="Calibri" w:eastAsia="Calibri"/>
+          <w:b/>
+          <w:i w:val="0"/>
+          <w:sz w:val="22"/>
+        </w:rPr>
+        <w:t>Development steps:</w:t>
+      </w:r>
+    </w:p>
+    <w:p>
+      <w:pPr>
+        <w:pStyle w:val="ListBullet"/>
+        <w:ind w:left="360"/>
+      </w:pPr>
+      <w:r>
+        <w:rPr>
+          <w:rFonts w:ascii="Calibri" w:hAnsi="Calibri" w:eastAsia="Calibri"/>
+          <w:b w:val="0"/>
+          <w:i w:val="0"/>
+          <w:sz w:val="22"/>
+        </w:rPr>
+        <w:t>Lab clinical-search RBAC: filter by entered_by.user_id (lab sees only own uploads)</w:t>
+      </w:r>
+    </w:p>
+    <w:p>
+      <w:pPr>
+        <w:pStyle w:val="ListBullet"/>
+        <w:ind w:left="360"/>
+      </w:pPr>
+      <w:r>
+        <w:rPr>
+          <w:rFonts w:ascii="Calibri" w:hAnsi="Calibri" w:eastAsia="Calibri"/>
+          <w:b w:val="0"/>
+          <w:i w:val="0"/>
+          <w:sz w:val="22"/>
+        </w:rPr>
+        <w:t>Persisted clinic gate tickets: ClinicGateTicket model + Postgres-backed 8h TTL</w:t>
+      </w:r>
+    </w:p>
+    <w:p>
+      <w:pPr>
+        <w:pStyle w:val="ListBullet"/>
+        <w:ind w:left="360"/>
+      </w:pPr>
+      <w:r>
+        <w:rPr>
+          <w:rFonts w:ascii="Calibri" w:hAnsi="Calibri" w:eastAsia="Calibri"/>
+          <w:b w:val="0"/>
+          <w:i w:val="0"/>
+          <w:sz w:val="22"/>
+        </w:rPr>
+        <w:t>Nginx hardening: Strict-Transport-Security (HSTS) on all HTTPS vhosts</w:t>
+      </w:r>
+    </w:p>
+    <w:p>
+      <w:pPr>
+        <w:pStyle w:val="ListBullet"/>
+        <w:ind w:left="360"/>
+      </w:pPr>
+      <w:r>
+        <w:rPr>
+          <w:rFonts w:ascii="Calibri" w:hAnsi="Calibri" w:eastAsia="Calibri"/>
+          <w:b w:val="0"/>
+          <w:i w:val="0"/>
+          <w:sz w:val="22"/>
+        </w:rPr>
+        <w:t>Android hardening: android:allowBackup="false" + release network security config</w:t>
+      </w:r>
+    </w:p>
+    <w:p>
+      <w:pPr>
+        <w:pStyle w:val="ListBullet"/>
+        <w:ind w:left="360"/>
+      </w:pPr>
+      <w:r>
+        <w:rPr>
+          <w:rFonts w:ascii="Calibri" w:hAnsi="Calibri" w:eastAsia="Calibri"/>
+          <w:b w:val="0"/>
+          <w:i w:val="0"/>
+          <w:sz w:val="22"/>
+        </w:rPr>
+        <w:t>Marketing assets: Pricing page, DPA template, One-page pitch (EN/HI), README</w:t>
+      </w:r>
+    </w:p>
+    <w:p>
+      <w:pPr>
+        <w:pStyle w:val="ListBullet"/>
+        <w:ind w:left="360"/>
+      </w:pPr>
+      <w:r>
+        <w:rPr>
+          <w:rFonts w:ascii="Calibri" w:hAnsi="Calibri" w:eastAsia="Calibri"/>
+          <w:b w:val="0"/>
+          <w:i w:val="0"/>
+          <w:sz w:val="22"/>
+        </w:rPr>
+        <w:t>Share APK v1.60 (versionCode 61) — assembleRelease build with hardening</w:t>
+      </w:r>
+    </w:p>
+    <w:p>
+      <w:pPr>
+        <w:spacing w:after="160" w:line="240" w:lineRule="auto"/>
+      </w:pPr>
+      <w:r>
+        <w:rPr>
+          <w:rFonts w:ascii="Calibri" w:hAnsi="Calibri" w:eastAsia="Calibri"/>
+          <w:b w:val="0"/>
+          <w:i w:val="0"/>
+          <w:sz w:val="22"/>
+        </w:rPr>
+        <w:t>Significance: Prepares the product for professional B2B rollout and Play Store standards.</w:t>
+      </w:r>
+    </w:p>
+    <w:p>
+      <w:pPr>
+        <w:spacing w:after="160" w:line="240" w:lineRule="auto"/>
+      </w:pPr>
+      <w:r>
+        <w:rPr>
+          <w:rFonts w:ascii="Calibri" w:hAnsi="Calibri" w:eastAsia="Calibri"/>
+          <w:b w:val="0"/>
+          <w:i/>
+          <w:sz w:val="22"/>
+        </w:rPr>
+        <w:t>How to verify: Lab search for foreign med → no result; restart API → clinic ticket still valid; curl -I https://api… shows HSTS header; adb install v1.60 on physical device.</w:t>
       </w:r>
     </w:p>
     <w:p>
@@ -4606,7 +4766,7 @@
                 <w:i w:val="0"/>
                 <w:sz w:val="18"/>
               </w:rPr>
-              <w:t>scripts/build_share_apk.cmd; More shows UI build stamp (v1.48 as of 14 Aug 2026)</w:t>
+              <w:t>scripts/build_share_apk.cmd; More shows UI build stamp (v1.60 as of 23 Aug 2026)</w:t>
             </w:r>
           </w:p>
         </w:tc>
@@ -4709,6 +4869,108 @@
                 <w:sz w:val="18"/>
               </w:rPr>
               <w:t>Implemented (lab_orders_json + /history/lab-orders; 15s poll)</w:t>
+            </w:r>
+          </w:p>
+        </w:tc>
+      </w:tr>
+      <w:tr>
+        <w:tc>
+          <w:tcPr>
+            <w:tcW w:type="dxa" w:w="4824"/>
+          </w:tcPr>
+          <w:p>
+            <w:r>
+              <w:rPr>
+                <w:rFonts w:ascii="Calibri" w:hAnsi="Calibri" w:eastAsia="Calibri"/>
+                <w:b w:val="0"/>
+                <w:i w:val="0"/>
+                <w:sz w:val="18"/>
+              </w:rPr>
+              <w:t>Persisted clinic tickets</w:t>
+            </w:r>
+          </w:p>
+        </w:tc>
+        <w:tc>
+          <w:tcPr>
+            <w:tcW w:type="dxa" w:w="4824"/>
+          </w:tcPr>
+          <w:p>
+            <w:r>
+              <w:rPr>
+                <w:rFonts w:ascii="Calibri" w:hAnsi="Calibri" w:eastAsia="Calibri"/>
+                <w:b w:val="0"/>
+                <w:i w:val="0"/>
+                <w:sz w:val="18"/>
+              </w:rPr>
+              <w:t>Implemented (Postgres-backed; survives API restart; 8h TTL)</w:t>
+            </w:r>
+          </w:p>
+        </w:tc>
+      </w:tr>
+      <w:tr>
+        <w:tc>
+          <w:tcPr>
+            <w:tcW w:type="dxa" w:w="4824"/>
+          </w:tcPr>
+          <w:p>
+            <w:r>
+              <w:rPr>
+                <w:rFonts w:ascii="Calibri" w:hAnsi="Calibri" w:eastAsia="Calibri"/>
+                <w:b w:val="0"/>
+                <w:i w:val="0"/>
+                <w:sz w:val="18"/>
+              </w:rPr>
+              <w:t>Lab clinical search RBAC</w:t>
+            </w:r>
+          </w:p>
+        </w:tc>
+        <w:tc>
+          <w:tcPr>
+            <w:tcW w:type="dxa" w:w="4824"/>
+          </w:tcPr>
+          <w:p>
+            <w:r>
+              <w:rPr>
+                <w:rFonts w:ascii="Calibri" w:hAnsi="Calibri" w:eastAsia="Calibri"/>
+                <w:b w:val="0"/>
+                <w:i w:val="0"/>
+                <w:sz w:val="18"/>
+              </w:rPr>
+              <w:t>Implemented (scoped to own uploads only)</w:t>
+            </w:r>
+          </w:p>
+        </w:tc>
+      </w:tr>
+      <w:tr>
+        <w:tc>
+          <w:tcPr>
+            <w:tcW w:type="dxa" w:w="4824"/>
+          </w:tcPr>
+          <w:p>
+            <w:r>
+              <w:rPr>
+                <w:rFonts w:ascii="Calibri" w:hAnsi="Calibri" w:eastAsia="Calibri"/>
+                <w:b w:val="0"/>
+                <w:i w:val="0"/>
+                <w:sz w:val="18"/>
+              </w:rPr>
+              <w:t>Marketing &amp; B2B assets</w:t>
+            </w:r>
+          </w:p>
+        </w:tc>
+        <w:tc>
+          <w:tcPr>
+            <w:tcW w:type="dxa" w:w="4824"/>
+          </w:tcPr>
+          <w:p>
+            <w:r>
+              <w:rPr>
+                <w:rFonts w:ascii="Calibri" w:hAnsi="Calibri" w:eastAsia="Calibri"/>
+                <w:b w:val="0"/>
+                <w:i w:val="0"/>
+                <w:sz w:val="18"/>
+              </w:rPr>
+              <w:t>Implemented (Pricing, DPA, Pitch deck)</w:t>
             </w:r>
           </w:p>
         </w:tc>
@@ -10992,6 +11254,108 @@
                 <w:sz w:val="18"/>
               </w:rPr>
               <w:t>Role-based route after locking from All patients or waiting list</w:t>
+            </w:r>
+          </w:p>
+        </w:tc>
+      </w:tr>
+      <w:tr>
+        <w:tc>
+          <w:tcPr>
+            <w:tcW w:type="dxa" w:w="4824"/>
+          </w:tcPr>
+          <w:p>
+            <w:r>
+              <w:rPr>
+                <w:rFonts w:ascii="Calibri" w:hAnsi="Calibri" w:eastAsia="Calibri"/>
+                <w:b w:val="0"/>
+                <w:i w:val="0"/>
+                <w:sz w:val="18"/>
+              </w:rPr>
+              <w:t>HSTS</w:t>
+            </w:r>
+          </w:p>
+        </w:tc>
+        <w:tc>
+          <w:tcPr>
+            <w:tcW w:type="dxa" w:w="4824"/>
+          </w:tcPr>
+          <w:p>
+            <w:r>
+              <w:rPr>
+                <w:rFonts w:ascii="Calibri" w:hAnsi="Calibri" w:eastAsia="Calibri"/>
+                <w:b w:val="0"/>
+                <w:i w:val="0"/>
+                <w:sz w:val="18"/>
+              </w:rPr>
+              <w:t>Strict-Transport-Security header — enforces HTTPS browser sessions</w:t>
+            </w:r>
+          </w:p>
+        </w:tc>
+      </w:tr>
+      <w:tr>
+        <w:tc>
+          <w:tcPr>
+            <w:tcW w:type="dxa" w:w="4824"/>
+          </w:tcPr>
+          <w:p>
+            <w:r>
+              <w:rPr>
+                <w:rFonts w:ascii="Calibri" w:hAnsi="Calibri" w:eastAsia="Calibri"/>
+                <w:b w:val="0"/>
+                <w:i w:val="0"/>
+                <w:sz w:val="18"/>
+              </w:rPr>
+              <w:t>DPA</w:t>
+            </w:r>
+          </w:p>
+        </w:tc>
+        <w:tc>
+          <w:tcPr>
+            <w:tcW w:type="dxa" w:w="4824"/>
+          </w:tcPr>
+          <w:p>
+            <w:r>
+              <w:rPr>
+                <w:rFonts w:ascii="Calibri" w:hAnsi="Calibri" w:eastAsia="Calibri"/>
+                <w:b w:val="0"/>
+                <w:i w:val="0"/>
+                <w:sz w:val="18"/>
+              </w:rPr>
+              <w:t>Data Processing Agreement — legal contract for clinic data fiduciaries</w:t>
+            </w:r>
+          </w:p>
+        </w:tc>
+      </w:tr>
+      <w:tr>
+        <w:tc>
+          <w:tcPr>
+            <w:tcW w:type="dxa" w:w="4824"/>
+          </w:tcPr>
+          <w:p>
+            <w:r>
+              <w:rPr>
+                <w:rFonts w:ascii="Calibri" w:hAnsi="Calibri" w:eastAsia="Calibri"/>
+                <w:b w:val="0"/>
+                <w:i w:val="0"/>
+                <w:sz w:val="18"/>
+              </w:rPr>
+              <w:t>Marketing Pitch</w:t>
+            </w:r>
+          </w:p>
+        </w:tc>
+        <w:tc>
+          <w:tcPr>
+            <w:tcW w:type="dxa" w:w="4824"/>
+          </w:tcPr>
+          <w:p>
+            <w:r>
+              <w:rPr>
+                <w:rFonts w:ascii="Calibri" w:hAnsi="Calibri" w:eastAsia="Calibri"/>
+                <w:b w:val="0"/>
+                <w:i w:val="0"/>
+                <w:sz w:val="18"/>
+              </w:rPr>
+              <w:t>Side-by-side English/Hindi 1-pager for B2B clinic sales</w:t>
             </w:r>
           </w:p>
         </w:tc>

</xml_diff>